<commit_message>
Regenerate milestone doc with Semble-access blocker removed
Co-Authored-By: Claude Opus 4.8 <noreply@anthropic.com>
Claude-Session: https://claude.ai/code/session_01Qk44oiJ6G4KGcJdussGzUo
</commit_message>
<xml_diff>
--- a/outputs/schoeman-clinic/Schoeman-Clinic-GoLive-Payment-Milestones.docx
+++ b/outputs/schoeman-clinic/Schoeman-Clinic-GoLive-Payment-Milestones.docx
@@ -792,7 +792,7 @@
           <w:i w:val="0"/>
           <w:sz w:val="21"/>
         </w:rPr>
-        <w:t>So client-side delays (Twilio top-up, Semble access, Meta verification) don’t hold up the portion WILBA fully controls, we suggest splitting the remaining balance:</w:t>
+        <w:t>So client-side delays (Twilio top-up, Meta verification, KB sign-off) don’t hold up the portion WILBA fully controls, we suggest splitting the remaining balance:</w:t>
       </w:r>
     </w:p>
     <w:tbl>
@@ -1094,22 +1094,6 @@
       </w:r>
       <w:r>
         <w:t>→ unblocks the Twilio voice number.</w:t>
-      </w:r>
-    </w:p>
-    <w:p>
-      <w:pPr>
-        <w:pStyle w:val="ListBullet"/>
-        <w:spacing w:after="60"/>
-      </w:pPr>
-      <w:r>
-        <w:rPr>
-          <w:b/>
-          <w:color w:val="8A5A0C"/>
-        </w:rPr>
-        <w:t xml:space="preserve">Semble admin access for Griffin </w:t>
-      </w:r>
-      <w:r>
-        <w:t>→ webhooks + patient export.</w:t>
       </w:r>
     </w:p>
     <w:p>

</xml_diff>